<commit_message>
Bewerbungsschreiben auf CONCORDIA Sachbearbeiter:in Post anpassen
Co-Authored-By: Claude Opus 5.5 <noreply@anthropic.com>
Claude-Session: https://claude.ai/code/session_01Hc7onFwdUiEGTMraWXu8vk
</commit_message>
<xml_diff>
--- a/Lorik_Duhanaj_Bewerbung_Postdienst_Luzern.docx
+++ b/Lorik_Duhanaj_Bewerbung_Postdienst_Luzern.docx
@@ -58,9 +58,8 @@
       <w:r>
         <w:rPr>
           <w:b w:val="0"/>
-          <w:highlight w:val="yellow"/>
         </w:rPr>
-        <w:t>[Name des Arbeitgebers]</w:t>
+        <w:t>CONCORDIA</w:t>
       </w:r>
     </w:p>
     <w:p>
@@ -131,14 +130,7 @@
         <w:rPr>
           <w:b/>
         </w:rPr>
-        <w:t xml:space="preserve">Bewerbung als </w:t>
-      </w:r>
-      <w:r>
-        <w:rPr>
-          <w:b/>
-          <w:highlight w:val="yellow"/>
-        </w:rPr>
-        <w:t>[genaue Stellenbezeichnung, z. B. Mitarbeiter Postdienst / Logistik]</w:t>
+        <w:t>Bewerbung als Sachbearbeiter:in Post – Praktikum ab August 2027</w:t>
       </w:r>
     </w:p>
     <w:p>
@@ -160,7 +152,7 @@
         <w:rPr>
           <w:b w:val="0"/>
         </w:rPr>
-        <w:t>Mit grossem Interesse bewerbe ich mich für die Stelle im internen Postdienst an Ihrem Standort am Bundesplatz in Luzern. Die Aufgabe verbindet genaues und zuverlässiges Arbeiten mit dem Kontakt zu Menschen, und genau das macht mir Freude. Besonders spricht mich an, dass ich nicht nur für einen pünktlichen Postdienst sorgen würde, sondern auch als Kurier zwischen Ihren Standorten unterwegs wäre, im Hausdienst und in der Hausdruckerei mit anpacken und für interne Stellen als Ansprechperson da sein könnte.</w:t>
+        <w:t>Mit grossem Interesse bewerbe ich mich bei der CONCORDIA für die Stelle als Sachbearbeiter:in Post. Zurzeit besuche ich das 3. Jahr der Wirtschaftsmittelschule und suche für mein Praktikumsjahr ab August 2027 eine Stelle zu 100 %. Die CONCORDIA als Expertin für Gesundheit spricht mich an, denn der Gesundheitsmarkt interessiert mich, weil er sich ständig weiterentwickelt und wirklich etwas bewegt. An dieser Stelle gefällt mir besonders, wie vielseitig sie ist: vom internen Postdienst über Kurierfahrten zwischen Ihren Standorten in Luzern bis zur Mitarbeit im Hausdienst und in der Hausdruckerei.</w:t>
       </w:r>
     </w:p>
     <w:p>
@@ -171,40 +163,18 @@
         <w:rPr>
           <w:b w:val="0"/>
         </w:rPr>
-        <w:t xml:space="preserve">Zurzeit besuche ich die Wirtschaftsmittelschule. </w:t>
+        <w:t>Erste Erfahrung im Postbereich konnte ich bereits sammeln: Im Betrieb meines Vaters helfe ich aus und verwalte dort die Post. Dabei achte ich darauf, dass alles pünktlich und sorgfältig erledigt wird, und mir ist bewusst, wie wichtig ein vertraulicher Umgang mit Unterlagen ist. Zudem besitze ich den Führerausweis der Kategorie B.</w:t>
       </w:r>
-      <w:r>
-        <w:rPr>
-          <w:b w:val="0"/>
-          <w:highlight w:val="yellow"/>
-        </w:rPr>
-        <w:t>[Abschluss / Grundbildung ergänzen]</w:t>
-      </w:r>
+    </w:p>
+    <w:p>
+      <w:pPr>
+        <w:spacing w:after="200"/>
+      </w:pPr>
       <w:r>
         <w:rPr>
           <w:b w:val="0"/>
         </w:rPr>
-        <w:t xml:space="preserve"> Dort habe ich gelernt, wie ein Unternehmen funktioniert, vor allem in den Fächern Wirtschaft und Recht sowie Rechnungswesen. Schon früh habe ich gerne am Computer gearbeitet </w:t>
-      </w:r>
-      <w:r>
-        <w:rPr>
-          <w:b w:val="0"/>
-          <w:highlight w:val="yellow"/>
-        </w:rPr>
-        <w:t>[MS-Office-Kenntnisse ergänzen]</w:t>
-      </w:r>
-      <w:r>
-        <w:rPr>
-          <w:b w:val="0"/>
-        </w:rPr>
-        <w:t xml:space="preserve">. Ich bin zuverlässig, arbeite gerne genau und gehe offen auf andere zu. Neben Deutsch spreche ich Französisch (Note 5) und dank meines dreiwöchigen Sprachaufenthalts in Brighton auch Englisch. </w:t>
-      </w:r>
-      <w:r>
-        <w:rPr>
-          <w:b w:val="0"/>
-          <w:highlight w:val="yellow"/>
-        </w:rPr>
-        <w:t>[Führerausweis Kategorie B ergänzen]</w:t>
+        <w:t>An der Wirtschaftsmittelschule machen mir die Fächer Wirtschaft und Recht sowie Rechnungswesen am meisten Spass, weil ich dort verstehe, wie ein Unternehmen funktioniert. Schon früh habe ich gerne am Computer gearbeitet und inzwischen mehrere ICDL-Advanced-Zertifikate erworben. Neben Deutsch spreche ich Französisch (Note 5) und dank meines dreiwöchigen Sprachaufenthalts in Brighton auch Englisch. Ich bin zuverlässig, arbeite genau und gehe offen auf andere zu. So kann ich auch als Ansprechperson für interne Stellen da sein und die Teams im Tagesgeschäft unterstützen.</w:t>
       </w:r>
     </w:p>
     <w:p>

</xml_diff>